<commit_message>
Lista de Pendientes: 'pendientes para ver con Lionel'
</commit_message>
<xml_diff>
--- a/Pendientes para ver con LIONEL.docx
+++ b/Pendientes para ver con LIONEL.docx
@@ -2,6 +2,28 @@
 <file path=word/document.xml><?xml version="1.0" encoding="utf-8"?>
 <w:document xmlns:wpc="http://schemas.microsoft.com/office/word/2010/wordprocessingCanvas" xmlns:mc="http://schemas.openxmlformats.org/markup-compatibility/2006" xmlns:o="urn:schemas-microsoft-com:office:office" xmlns:r="http://schemas.openxmlformats.org/officeDocument/2006/relationships" xmlns:m="http://schemas.openxmlformats.org/officeDocument/2006/math" xmlns:v="urn:schemas-microsoft-com:vml" xmlns:wp14="http://schemas.microsoft.com/office/word/2010/wordprocessingDrawing" xmlns:wp="http://schemas.openxmlformats.org/drawingml/2006/wordprocessingDrawing" xmlns:w10="urn:schemas-microsoft-com:office:word" xmlns:w="http://schemas.openxmlformats.org/wordprocessingml/2006/main" xmlns:w14="http://schemas.microsoft.com/office/word/2010/wordml" xmlns:wpg="http://schemas.microsoft.com/office/word/2010/wordprocessingGroup" xmlns:wpi="http://schemas.microsoft.com/office/word/2010/wordprocessingInk" xmlns:wne="http://schemas.microsoft.com/office/word/2006/wordml" xmlns:wps="http://schemas.microsoft.com/office/word/2010/wordprocessingShape" mc:Ignorable="w14 wp14">
   <w:body>
+    <w:p>
+      <w:r>
+        <w:t>Celeste</w:t>
+      </w:r>
+      <w:r>
+        <w:t>: LUMA</w:t>
+      </w:r>
+      <w:r>
+        <w:tab/>
+      </w:r>
+      <w:r>
+        <w:tab/>
+        <w:t>Verde: LIONEL</w:t>
+      </w:r>
+      <w:r>
+        <w:tab/>
+      </w:r>
+      <w:r>
+        <w:tab/>
+        <w:t>Amarillo: GLADYS</w:t>
+      </w:r>
+    </w:p>
     <w:p>
       <w:r>
         <w:t xml:space="preserve">PAGES / </w:t>
@@ -83,8 +105,6 @@
       <w:r>
         <w:t>.js: Conectar con BBDD</w:t>
       </w:r>
-      <w:bookmarkStart w:id="0" w:name="_GoBack"/>
-      <w:bookmarkEnd w:id="0"/>
     </w:p>
     <w:p>
       <w:pPr>
@@ -157,14 +177,21 @@
           <w:ilvl w:val="0"/>
           <w:numId w:val="1"/>
         </w:numPr>
+        <w:rPr>
+          <w:strike/>
+        </w:rPr>
       </w:pPr>
       <w:r>
         <w:rPr>
           <w:b/>
+          <w:strike/>
         </w:rPr>
         <w:t>pageMenuVentas</w:t>
       </w:r>
       <w:r>
+        <w:rPr>
+          <w:strike/>
+        </w:rPr>
         <w:t>.js: LISTO</w:t>
       </w:r>
     </w:p>
@@ -194,42 +221,40 @@
           <w:numId w:val="1"/>
         </w:numPr>
         <w:rPr>
-          <w:color w:val="FF0000"/>
+          <w:strike/>
         </w:rPr>
       </w:pPr>
       <w:r>
         <w:rPr>
           <w:b/>
+          <w:strike/>
         </w:rPr>
         <w:t>ventaactual</w:t>
       </w:r>
       <w:r>
-        <w:t xml:space="preserve">.js: </w:t>
-      </w:r>
-      <w:r>
-        <w:rPr>
-          <w:color w:val="FF0000"/>
-        </w:rPr>
-        <w:t xml:space="preserve">poner el </w:t>
+        <w:rPr>
+          <w:strike/>
+        </w:rPr>
+        <w:t xml:space="preserve">.js: poner el </w:t>
       </w:r>
       <w:proofErr w:type="spellStart"/>
       <w:r>
         <w:rPr>
-          <w:color w:val="FF0000"/>
+          <w:strike/>
         </w:rPr>
         <w:t>btnContainer</w:t>
       </w:r>
       <w:proofErr w:type="spellEnd"/>
       <w:r>
         <w:rPr>
-          <w:color w:val="FF0000"/>
+          <w:strike/>
         </w:rPr>
         <w:t xml:space="preserve"> en el </w:t>
       </w:r>
       <w:proofErr w:type="spellStart"/>
       <w:r>
         <w:rPr>
-          <w:color w:val="FF0000"/>
+          <w:strike/>
         </w:rPr>
         <w:t>footer</w:t>
       </w:r>
@@ -250,30 +275,15 @@
         <w:t>ventasdeldia</w:t>
       </w:r>
       <w:r>
-        <w:t xml:space="preserve">.js: </w:t>
-      </w:r>
-      <w:r>
-        <w:rPr>
-          <w:color w:val="FF0000"/>
-        </w:rPr>
-        <w:t xml:space="preserve">poner el BTN de descarga en el </w:t>
+        <w:t xml:space="preserve">.js: poner el BTN de descarga en el </w:t>
       </w:r>
       <w:proofErr w:type="spellStart"/>
       <w:r>
-        <w:rPr>
-          <w:color w:val="FF0000"/>
-        </w:rPr>
         <w:t>Footer</w:t>
       </w:r>
       <w:proofErr w:type="spellEnd"/>
       <w:r>
-        <w:rPr>
-          <w:color w:val="FF0000"/>
-        </w:rPr>
-        <w:t xml:space="preserve"> </w:t>
-      </w:r>
-      <w:r>
-        <w:t xml:space="preserve">(separado del </w:t>
+        <w:t xml:space="preserve"> (separado del </w:t>
       </w:r>
       <w:proofErr w:type="spellStart"/>
       <w:r>
@@ -294,6 +304,30 @@
       <w:proofErr w:type="spellEnd"/>
       <w:r>
         <w:t xml:space="preserve"> con las ventas del día desde BBDD</w:t>
+      </w:r>
+      <w:bookmarkStart w:id="0" w:name="_GoBack"/>
+      <w:bookmarkEnd w:id="0"/>
+      <w:r>
+        <w:br/>
+        <w:t>Función para descargar</w:t>
+      </w:r>
+    </w:p>
+    <w:p>
+      <w:pPr>
+        <w:pStyle w:val="Prrafodelista"/>
+        <w:ind w:left="644"/>
+      </w:pPr>
+      <w:r>
+        <w:t>Si se descargó</w:t>
+      </w:r>
+      <w:r>
+        <w:t xml:space="preserve"> el archivo</w:t>
+      </w:r>
+      <w:r>
+        <w:t xml:space="preserve">, debe salir una notificación confirmando y sino otra notificación </w:t>
+      </w:r>
+      <w:r>
+        <w:t>avisando que hubo un problema.</w:t>
       </w:r>
     </w:p>
     <w:p>
@@ -333,7 +367,7 @@
       <w:lvlText w:val="%1)"/>
       <w:lvlJc w:val="left"/>
       <w:pPr>
-        <w:ind w:left="720" w:hanging="360"/>
+        <w:ind w:left="644" w:hanging="360"/>
       </w:pPr>
       <w:rPr>
         <w:rFonts w:hint="default"/>
@@ -345,7 +379,7 @@
       <w:lvlText w:val="%2."/>
       <w:lvlJc w:val="left"/>
       <w:pPr>
-        <w:ind w:left="1440" w:hanging="360"/>
+        <w:ind w:left="1364" w:hanging="360"/>
       </w:pPr>
     </w:lvl>
     <w:lvl w:ilvl="2" w:tplc="2C0A001B" w:tentative="1">
@@ -354,7 +388,7 @@
       <w:lvlText w:val="%3."/>
       <w:lvlJc w:val="right"/>
       <w:pPr>
-        <w:ind w:left="2160" w:hanging="180"/>
+        <w:ind w:left="2084" w:hanging="180"/>
       </w:pPr>
     </w:lvl>
     <w:lvl w:ilvl="3" w:tplc="2C0A000F" w:tentative="1">
@@ -363,7 +397,7 @@
       <w:lvlText w:val="%4."/>
       <w:lvlJc w:val="left"/>
       <w:pPr>
-        <w:ind w:left="2880" w:hanging="360"/>
+        <w:ind w:left="2804" w:hanging="360"/>
       </w:pPr>
     </w:lvl>
     <w:lvl w:ilvl="4" w:tplc="2C0A0019" w:tentative="1">
@@ -372,7 +406,7 @@
       <w:lvlText w:val="%5."/>
       <w:lvlJc w:val="left"/>
       <w:pPr>
-        <w:ind w:left="3600" w:hanging="360"/>
+        <w:ind w:left="3524" w:hanging="360"/>
       </w:pPr>
     </w:lvl>
     <w:lvl w:ilvl="5" w:tplc="2C0A001B" w:tentative="1">
@@ -381,7 +415,7 @@
       <w:lvlText w:val="%6."/>
       <w:lvlJc w:val="right"/>
       <w:pPr>
-        <w:ind w:left="4320" w:hanging="180"/>
+        <w:ind w:left="4244" w:hanging="180"/>
       </w:pPr>
     </w:lvl>
     <w:lvl w:ilvl="6" w:tplc="2C0A000F" w:tentative="1">
@@ -390,7 +424,7 @@
       <w:lvlText w:val="%7."/>
       <w:lvlJc w:val="left"/>
       <w:pPr>
-        <w:ind w:left="5040" w:hanging="360"/>
+        <w:ind w:left="4964" w:hanging="360"/>
       </w:pPr>
     </w:lvl>
     <w:lvl w:ilvl="7" w:tplc="2C0A0019" w:tentative="1">
@@ -399,7 +433,7 @@
       <w:lvlText w:val="%8."/>
       <w:lvlJc w:val="left"/>
       <w:pPr>
-        <w:ind w:left="5760" w:hanging="360"/>
+        <w:ind w:left="5684" w:hanging="360"/>
       </w:pPr>
     </w:lvl>
     <w:lvl w:ilvl="8" w:tplc="2C0A001B" w:tentative="1">
@@ -408,7 +442,7 @@
       <w:lvlText w:val="%9."/>
       <w:lvlJc w:val="right"/>
       <w:pPr>
-        <w:ind w:left="6480" w:hanging="180"/>
+        <w:ind w:left="6404" w:hanging="180"/>
       </w:pPr>
     </w:lvl>
   </w:abstractNum>

</xml_diff>

<commit_message>
[fix] en proceso carga de producto en stockporremito
</commit_message>
<xml_diff>
--- a/Pendientes para ver con LIONEL.docx
+++ b/Pendientes para ver con LIONEL.docx
@@ -1,6 +1,6 @@
 
 <file path=word/document.xml><?xml version="1.0" encoding="utf-8"?>
-<w:document xmlns:wpc="http://schemas.microsoft.com/office/word/2010/wordprocessingCanvas" xmlns:mc="http://schemas.openxmlformats.org/markup-compatibility/2006" xmlns:o="urn:schemas-microsoft-com:office:office" xmlns:r="http://schemas.openxmlformats.org/officeDocument/2006/relationships" xmlns:m="http://schemas.openxmlformats.org/officeDocument/2006/math" xmlns:v="urn:schemas-microsoft-com:vml" xmlns:wp14="http://schemas.microsoft.com/office/word/2010/wordprocessingDrawing" xmlns:wp="http://schemas.openxmlformats.org/drawingml/2006/wordprocessingDrawing" xmlns:w10="urn:schemas-microsoft-com:office:word" xmlns:w="http://schemas.openxmlformats.org/wordprocessingml/2006/main" xmlns:w14="http://schemas.microsoft.com/office/word/2010/wordml" xmlns:wpg="http://schemas.microsoft.com/office/word/2010/wordprocessingGroup" xmlns:wpi="http://schemas.microsoft.com/office/word/2010/wordprocessingInk" xmlns:wne="http://schemas.microsoft.com/office/word/2006/wordml" xmlns:wps="http://schemas.microsoft.com/office/word/2010/wordprocessingShape" mc:Ignorable="w14 wp14">
+<w:document xmlns:ve="http://schemas.openxmlformats.org/markup-compatibility/2006" xmlns:o="urn:schemas-microsoft-com:office:office" xmlns:r="http://schemas.openxmlformats.org/officeDocument/2006/relationships" xmlns:m="http://schemas.openxmlformats.org/officeDocument/2006/math" xmlns:v="urn:schemas-microsoft-com:vml" xmlns:wp="http://schemas.openxmlformats.org/drawingml/2006/wordprocessingDrawing" xmlns:w10="urn:schemas-microsoft-com:office:word" xmlns:w="http://schemas.openxmlformats.org/wordprocessingml/2006/main" xmlns:wne="http://schemas.microsoft.com/office/word/2006/wordml">
   <w:body>
     <w:p>
       <w:r>
@@ -333,13 +333,43 @@
     <w:p>
       <w:pPr>
         <w:pStyle w:val="Prrafodelista"/>
-        <w:numPr>
-          <w:ilvl w:val="0"/>
-          <w:numId w:val="1"/>
-        </w:numPr>
-      </w:pPr>
-      <w:r>
-        <w:br/>
+        <w:ind w:left="0"/>
+      </w:pPr>
+      <w:r>
+        <w:t>PAGES/</w:t>
+      </w:r>
+      <w:proofErr w:type="spellStart"/>
+      <w:r>
+        <w:t>SecciónStock</w:t>
+      </w:r>
+      <w:proofErr w:type="spellEnd"/>
+    </w:p>
+    <w:p>
+      <w:pPr>
+        <w:pStyle w:val="Prrafodelista"/>
+        <w:ind w:left="284"/>
+      </w:pPr>
+      <w:r>
+        <w:t>11)</w:t>
+      </w:r>
+      <w:proofErr w:type="spellStart"/>
+      <w:r>
+        <w:rPr>
+          <w:b/>
+          <w:highlight w:val="cyan"/>
+          <w:u w:val="single"/>
+        </w:rPr>
+        <w:t>stockcargaxremito</w:t>
+      </w:r>
+      <w:proofErr w:type="spellEnd"/>
+      <w:r>
+        <w:rPr>
+          <w:highlight w:val="cyan"/>
+        </w:rPr>
+        <w:t>:</w:t>
+      </w:r>
+      <w:r>
+        <w:t xml:space="preserve"> completando carga de producto</w:t>
       </w:r>
       <w:r>
         <w:br/>
@@ -356,7 +386,7 @@
 </file>
 
 <file path=word/numbering.xml><?xml version="1.0" encoding="utf-8"?>
-<w:numbering xmlns:wpc="http://schemas.microsoft.com/office/word/2010/wordprocessingCanvas" xmlns:mc="http://schemas.openxmlformats.org/markup-compatibility/2006" xmlns:o="urn:schemas-microsoft-com:office:office" xmlns:r="http://schemas.openxmlformats.org/officeDocument/2006/relationships" xmlns:m="http://schemas.openxmlformats.org/officeDocument/2006/math" xmlns:v="urn:schemas-microsoft-com:vml" xmlns:wp14="http://schemas.microsoft.com/office/word/2010/wordprocessingDrawing" xmlns:wp="http://schemas.openxmlformats.org/drawingml/2006/wordprocessingDrawing" xmlns:w10="urn:schemas-microsoft-com:office:word" xmlns:w="http://schemas.openxmlformats.org/wordprocessingml/2006/main" xmlns:w14="http://schemas.microsoft.com/office/word/2010/wordml" xmlns:wpg="http://schemas.microsoft.com/office/word/2010/wordprocessingGroup" xmlns:wpi="http://schemas.microsoft.com/office/word/2010/wordprocessingInk" xmlns:wne="http://schemas.microsoft.com/office/word/2006/wordml" xmlns:wps="http://schemas.microsoft.com/office/word/2010/wordprocessingShape" mc:Ignorable="w14 wp14">
+<w:numbering xmlns:ve="http://schemas.openxmlformats.org/markup-compatibility/2006" xmlns:o="urn:schemas-microsoft-com:office:office" xmlns:r="http://schemas.openxmlformats.org/officeDocument/2006/relationships" xmlns:m="http://schemas.openxmlformats.org/officeDocument/2006/math" xmlns:v="urn:schemas-microsoft-com:vml" xmlns:wp="http://schemas.openxmlformats.org/drawingml/2006/wordprocessingDrawing" xmlns:w10="urn:schemas-microsoft-com:office:word" xmlns:w="http://schemas.openxmlformats.org/wordprocessingml/2006/main" xmlns:wne="http://schemas.microsoft.com/office/word/2006/wordml">
   <w:abstractNum w:abstractNumId="0">
     <w:nsid w:val="5CEC1E00"/>
     <w:multiLevelType w:val="hybridMultilevel"/>
@@ -453,7 +483,7 @@
 </file>
 
 <file path=word/styles.xml><?xml version="1.0" encoding="utf-8"?>
-<w:styles xmlns:mc="http://schemas.openxmlformats.org/markup-compatibility/2006" xmlns:r="http://schemas.openxmlformats.org/officeDocument/2006/relationships" xmlns:w="http://schemas.openxmlformats.org/wordprocessingml/2006/main" xmlns:w14="http://schemas.microsoft.com/office/word/2010/wordml" mc:Ignorable="w14">
+<w:styles xmlns:r="http://schemas.openxmlformats.org/officeDocument/2006/relationships" xmlns:w="http://schemas.openxmlformats.org/wordprocessingml/2006/main">
   <w:docDefaults>
     <w:rPrDefault>
       <w:rPr>
@@ -611,6 +641,7 @@
   <w:style w:type="paragraph" w:default="1" w:styleId="Normal">
     <w:name w:val="Normal"/>
     <w:qFormat/>
+    <w:rsid w:val="00CC16BB"/>
   </w:style>
   <w:style w:type="character" w:default="1" w:styleId="Fuentedeprrafopredeter">
     <w:name w:val="Default Paragraph Font"/>
@@ -623,6 +654,7 @@
     <w:uiPriority w:val="99"/>
     <w:semiHidden/>
     <w:unhideWhenUsed/>
+    <w:qFormat/>
     <w:tblPr>
       <w:tblInd w:w="0" w:type="dxa"/>
       <w:tblCellMar>

</xml_diff>